<commit_message>
New file for SQL questions, fixed get date in the product table, deleted the Logical part of the ERD and fixed the Conceptual for the ppt.
</commit_message>
<xml_diff>
--- a/DataDictionaryNetOnNet.docx
+++ b/DataDictionaryNetOnNet.docx
@@ -290,6 +290,11 @@
     </w:p>
     <w:p>
       <w:pPr>
+        <w:pStyle w:val="Liststycke"/>
+        <w:numPr>
+          <w:ilvl w:val="0"/>
+          <w:numId w:val="1"/>
+        </w:numPr>
         <w:rPr>
           <w:lang w:val="en-SE"/>
         </w:rPr>
@@ -325,6 +330,11 @@
     </w:p>
     <w:p>
       <w:pPr>
+        <w:pStyle w:val="Liststycke"/>
+        <w:numPr>
+          <w:ilvl w:val="0"/>
+          <w:numId w:val="1"/>
+        </w:numPr>
         <w:rPr>
           <w:lang w:val="en-SE"/>
         </w:rPr>
@@ -399,11 +409,36 @@
         <w:t>DimDate</w:t>
       </w:r>
       <w:proofErr w:type="spellEnd"/>
+    </w:p>
+    <w:p>
+      <w:pPr>
+        <w:rPr>
+          <w:lang w:val="en-SE"/>
+        </w:rPr>
+      </w:pPr>
+    </w:p>
+    <w:p>
+      <w:pPr>
+        <w:jc w:val="center"/>
+        <w:rPr>
+          <w:b/>
+          <w:bCs/>
+          <w:lang w:val="en-SE"/>
+        </w:rPr>
+      </w:pPr>
+      <w:r>
+        <w:rPr>
+          <w:b/>
+          <w:bCs/>
+          <w:lang w:val="en-SE"/>
+        </w:rPr>
+        <w:t>SCD Strategy</w:t>
+      </w:r>
     </w:p>
     <w:tbl>
       <w:tblPr>
         <w:tblStyle w:val="Tabellrutnt"/>
-        <w:tblpPr w:leftFromText="180" w:rightFromText="180" w:vertAnchor="page" w:horzAnchor="margin" w:tblpY="7569"/>
+        <w:tblpPr w:leftFromText="180" w:rightFromText="180" w:vertAnchor="page" w:horzAnchor="margin" w:tblpY="7404"/>
         <w:tblW w:w="9030" w:type="dxa"/>
         <w:tblLook w:val="04A0" w:firstRow="1" w:lastRow="0" w:firstColumn="1" w:lastColumn="0" w:noHBand="0" w:noVBand="1"/>
       </w:tblPr>
@@ -421,12 +456,19 @@
             <w:tcW w:w="2409" w:type="dxa"/>
           </w:tcPr>
           <w:p>
+            <w:pPr>
+              <w:rPr>
+                <w:b/>
+                <w:bCs/>
+              </w:rPr>
+            </w:pPr>
             <w:proofErr w:type="spellStart"/>
             <w:r>
-              <w:t>Fact</w:t>
-            </w:r>
-            <w:r>
-              <w:t>Sales</w:t>
+              <w:rPr>
+                <w:b/>
+                <w:bCs/>
+              </w:rPr>
+              <w:t>FactSales</w:t>
             </w:r>
             <w:proofErr w:type="spellEnd"/>
           </w:p>
@@ -436,7 +478,17 @@
             <w:tcW w:w="1988" w:type="dxa"/>
           </w:tcPr>
           <w:p>
+            <w:pPr>
+              <w:rPr>
+                <w:b/>
+                <w:bCs/>
+              </w:rPr>
+            </w:pPr>
             <w:r>
+              <w:rPr>
+                <w:b/>
+                <w:bCs/>
+              </w:rPr>
               <w:t>SCD Type</w:t>
             </w:r>
           </w:p>
@@ -446,7 +498,17 @@
             <w:tcW w:w="4633" w:type="dxa"/>
           </w:tcPr>
           <w:p>
+            <w:pPr>
+              <w:rPr>
+                <w:b/>
+                <w:bCs/>
+              </w:rPr>
+            </w:pPr>
             <w:r>
+              <w:rPr>
+                <w:b/>
+                <w:bCs/>
+              </w:rPr>
               <w:t>Reason</w:t>
             </w:r>
           </w:p>
@@ -677,7 +739,10 @@
     </w:tbl>
     <w:p>
       <w:pPr>
-        <w:rPr>
+        <w:jc w:val="center"/>
+        <w:rPr>
+          <w:b/>
+          <w:bCs/>
           <w:lang w:val="en-SE"/>
         </w:rPr>
       </w:pPr>
@@ -688,17 +753,621 @@
         <w:rPr>
           <w:b/>
           <w:bCs/>
-          <w:lang w:val="en-SE"/>
+          <w:lang w:val="sv-SE"/>
         </w:rPr>
       </w:pPr>
-      <w:r>
+    </w:p>
+    <w:tbl>
+      <w:tblPr>
+        <w:tblStyle w:val="Tabellrutnt"/>
+        <w:tblW w:w="0" w:type="auto"/>
+        <w:tblLook w:val="04A0" w:firstRow="1" w:lastRow="0" w:firstColumn="1" w:lastColumn="0" w:noHBand="0" w:noVBand="1"/>
+      </w:tblPr>
+      <w:tblGrid>
+        <w:gridCol w:w="3005"/>
+        <w:gridCol w:w="3005"/>
+        <w:gridCol w:w="3006"/>
+      </w:tblGrid>
+      <w:tr>
+        <w:tc>
+          <w:tcPr>
+            <w:tcW w:w="3005" w:type="dxa"/>
+          </w:tcPr>
+          <w:p>
+            <w:pPr>
+              <w:jc w:val="center"/>
+              <w:rPr>
+                <w:b/>
+                <w:bCs/>
+                <w:lang w:val="en-SE"/>
+              </w:rPr>
+            </w:pPr>
+            <w:proofErr w:type="spellStart"/>
+            <w:r>
+              <w:rPr>
+                <w:b/>
+                <w:bCs/>
+                <w:lang w:val="en-SE"/>
+              </w:rPr>
+              <w:t>DimProduct</w:t>
+            </w:r>
+            <w:proofErr w:type="spellEnd"/>
+          </w:p>
+        </w:tc>
+        <w:tc>
+          <w:tcPr>
+            <w:tcW w:w="3005" w:type="dxa"/>
+          </w:tcPr>
+          <w:p>
+            <w:pPr>
+              <w:jc w:val="center"/>
+              <w:rPr>
+                <w:b/>
+                <w:bCs/>
+                <w:lang w:val="en-SE"/>
+              </w:rPr>
+            </w:pPr>
+            <w:r>
+              <w:rPr>
+                <w:b/>
+                <w:bCs/>
+                <w:lang w:val="en-SE"/>
+              </w:rPr>
+              <w:t>SCD Type</w:t>
+            </w:r>
+          </w:p>
+        </w:tc>
+        <w:tc>
+          <w:tcPr>
+            <w:tcW w:w="3006" w:type="dxa"/>
+          </w:tcPr>
+          <w:p>
+            <w:pPr>
+              <w:jc w:val="center"/>
+              <w:rPr>
+                <w:b/>
+                <w:bCs/>
+                <w:lang w:val="en-SE"/>
+              </w:rPr>
+            </w:pPr>
+            <w:r>
+              <w:rPr>
+                <w:b/>
+                <w:bCs/>
+                <w:lang w:val="en-SE"/>
+              </w:rPr>
+              <w:t>Reason</w:t>
+            </w:r>
+          </w:p>
+        </w:tc>
+      </w:tr>
+      <w:tr>
+        <w:tc>
+          <w:tcPr>
+            <w:tcW w:w="3005" w:type="dxa"/>
+          </w:tcPr>
+          <w:p>
+            <w:pPr>
+              <w:jc w:val="center"/>
+              <w:rPr>
+                <w:b/>
+                <w:bCs/>
+                <w:lang w:val="en-SE"/>
+              </w:rPr>
+            </w:pPr>
+          </w:p>
+        </w:tc>
+        <w:tc>
+          <w:tcPr>
+            <w:tcW w:w="3005" w:type="dxa"/>
+          </w:tcPr>
+          <w:p>
+            <w:pPr>
+              <w:jc w:val="center"/>
+              <w:rPr>
+                <w:b/>
+                <w:bCs/>
+                <w:lang w:val="en-SE"/>
+              </w:rPr>
+            </w:pPr>
+          </w:p>
+        </w:tc>
+        <w:tc>
+          <w:tcPr>
+            <w:tcW w:w="3006" w:type="dxa"/>
+          </w:tcPr>
+          <w:p>
+            <w:pPr>
+              <w:jc w:val="center"/>
+              <w:rPr>
+                <w:b/>
+                <w:bCs/>
+                <w:lang w:val="en-SE"/>
+              </w:rPr>
+            </w:pPr>
+          </w:p>
+        </w:tc>
+      </w:tr>
+      <w:tr>
+        <w:tc>
+          <w:tcPr>
+            <w:tcW w:w="3005" w:type="dxa"/>
+          </w:tcPr>
+          <w:p>
+            <w:pPr>
+              <w:jc w:val="center"/>
+              <w:rPr>
+                <w:b/>
+                <w:bCs/>
+                <w:lang w:val="en-SE"/>
+              </w:rPr>
+            </w:pPr>
+          </w:p>
+        </w:tc>
+        <w:tc>
+          <w:tcPr>
+            <w:tcW w:w="3005" w:type="dxa"/>
+          </w:tcPr>
+          <w:p>
+            <w:pPr>
+              <w:jc w:val="center"/>
+              <w:rPr>
+                <w:b/>
+                <w:bCs/>
+                <w:lang w:val="en-SE"/>
+              </w:rPr>
+            </w:pPr>
+          </w:p>
+        </w:tc>
+        <w:tc>
+          <w:tcPr>
+            <w:tcW w:w="3006" w:type="dxa"/>
+          </w:tcPr>
+          <w:p>
+            <w:pPr>
+              <w:jc w:val="center"/>
+              <w:rPr>
+                <w:b/>
+                <w:bCs/>
+                <w:lang w:val="en-SE"/>
+              </w:rPr>
+            </w:pPr>
+          </w:p>
+        </w:tc>
+      </w:tr>
+      <w:tr>
+        <w:tc>
+          <w:tcPr>
+            <w:tcW w:w="3005" w:type="dxa"/>
+          </w:tcPr>
+          <w:p>
+            <w:pPr>
+              <w:jc w:val="center"/>
+              <w:rPr>
+                <w:b/>
+                <w:bCs/>
+                <w:lang w:val="en-SE"/>
+              </w:rPr>
+            </w:pPr>
+          </w:p>
+        </w:tc>
+        <w:tc>
+          <w:tcPr>
+            <w:tcW w:w="3005" w:type="dxa"/>
+          </w:tcPr>
+          <w:p>
+            <w:pPr>
+              <w:jc w:val="center"/>
+              <w:rPr>
+                <w:b/>
+                <w:bCs/>
+                <w:lang w:val="en-SE"/>
+              </w:rPr>
+            </w:pPr>
+          </w:p>
+        </w:tc>
+        <w:tc>
+          <w:tcPr>
+            <w:tcW w:w="3006" w:type="dxa"/>
+          </w:tcPr>
+          <w:p>
+            <w:pPr>
+              <w:jc w:val="center"/>
+              <w:rPr>
+                <w:b/>
+                <w:bCs/>
+                <w:lang w:val="en-SE"/>
+              </w:rPr>
+            </w:pPr>
+          </w:p>
+        </w:tc>
+      </w:tr>
+      <w:tr>
+        <w:tc>
+          <w:tcPr>
+            <w:tcW w:w="3005" w:type="dxa"/>
+          </w:tcPr>
+          <w:p>
+            <w:pPr>
+              <w:jc w:val="center"/>
+              <w:rPr>
+                <w:b/>
+                <w:bCs/>
+                <w:lang w:val="en-SE"/>
+              </w:rPr>
+            </w:pPr>
+          </w:p>
+        </w:tc>
+        <w:tc>
+          <w:tcPr>
+            <w:tcW w:w="3005" w:type="dxa"/>
+          </w:tcPr>
+          <w:p>
+            <w:pPr>
+              <w:jc w:val="center"/>
+              <w:rPr>
+                <w:b/>
+                <w:bCs/>
+                <w:lang w:val="en-SE"/>
+              </w:rPr>
+            </w:pPr>
+          </w:p>
+        </w:tc>
+        <w:tc>
+          <w:tcPr>
+            <w:tcW w:w="3006" w:type="dxa"/>
+          </w:tcPr>
+          <w:p>
+            <w:pPr>
+              <w:jc w:val="center"/>
+              <w:rPr>
+                <w:b/>
+                <w:bCs/>
+                <w:lang w:val="en-SE"/>
+              </w:rPr>
+            </w:pPr>
+          </w:p>
+        </w:tc>
+      </w:tr>
+      <w:tr>
+        <w:tc>
+          <w:tcPr>
+            <w:tcW w:w="3005" w:type="dxa"/>
+          </w:tcPr>
+          <w:p>
+            <w:pPr>
+              <w:jc w:val="center"/>
+              <w:rPr>
+                <w:b/>
+                <w:bCs/>
+                <w:lang w:val="en-SE"/>
+              </w:rPr>
+            </w:pPr>
+          </w:p>
+        </w:tc>
+        <w:tc>
+          <w:tcPr>
+            <w:tcW w:w="3005" w:type="dxa"/>
+          </w:tcPr>
+          <w:p>
+            <w:pPr>
+              <w:jc w:val="center"/>
+              <w:rPr>
+                <w:b/>
+                <w:bCs/>
+                <w:lang w:val="en-SE"/>
+              </w:rPr>
+            </w:pPr>
+          </w:p>
+        </w:tc>
+        <w:tc>
+          <w:tcPr>
+            <w:tcW w:w="3006" w:type="dxa"/>
+          </w:tcPr>
+          <w:p>
+            <w:pPr>
+              <w:jc w:val="center"/>
+              <w:rPr>
+                <w:b/>
+                <w:bCs/>
+                <w:lang w:val="en-SE"/>
+              </w:rPr>
+            </w:pPr>
+          </w:p>
+        </w:tc>
+      </w:tr>
+      <w:tr>
+        <w:tc>
+          <w:tcPr>
+            <w:tcW w:w="3005" w:type="dxa"/>
+          </w:tcPr>
+          <w:p>
+            <w:pPr>
+              <w:jc w:val="center"/>
+              <w:rPr>
+                <w:b/>
+                <w:bCs/>
+                <w:lang w:val="en-SE"/>
+              </w:rPr>
+            </w:pPr>
+          </w:p>
+        </w:tc>
+        <w:tc>
+          <w:tcPr>
+            <w:tcW w:w="3005" w:type="dxa"/>
+          </w:tcPr>
+          <w:p>
+            <w:pPr>
+              <w:jc w:val="center"/>
+              <w:rPr>
+                <w:b/>
+                <w:bCs/>
+                <w:lang w:val="en-SE"/>
+              </w:rPr>
+            </w:pPr>
+          </w:p>
+        </w:tc>
+        <w:tc>
+          <w:tcPr>
+            <w:tcW w:w="3006" w:type="dxa"/>
+          </w:tcPr>
+          <w:p>
+            <w:pPr>
+              <w:jc w:val="center"/>
+              <w:rPr>
+                <w:b/>
+                <w:bCs/>
+                <w:lang w:val="en-SE"/>
+              </w:rPr>
+            </w:pPr>
+          </w:p>
+        </w:tc>
+      </w:tr>
+      <w:tr>
+        <w:tc>
+          <w:tcPr>
+            <w:tcW w:w="3005" w:type="dxa"/>
+          </w:tcPr>
+          <w:p>
+            <w:pPr>
+              <w:jc w:val="center"/>
+              <w:rPr>
+                <w:b/>
+                <w:bCs/>
+                <w:lang w:val="en-SE"/>
+              </w:rPr>
+            </w:pPr>
+          </w:p>
+        </w:tc>
+        <w:tc>
+          <w:tcPr>
+            <w:tcW w:w="3005" w:type="dxa"/>
+          </w:tcPr>
+          <w:p>
+            <w:pPr>
+              <w:jc w:val="center"/>
+              <w:rPr>
+                <w:b/>
+                <w:bCs/>
+                <w:lang w:val="en-SE"/>
+              </w:rPr>
+            </w:pPr>
+          </w:p>
+        </w:tc>
+        <w:tc>
+          <w:tcPr>
+            <w:tcW w:w="3006" w:type="dxa"/>
+          </w:tcPr>
+          <w:p>
+            <w:pPr>
+              <w:jc w:val="center"/>
+              <w:rPr>
+                <w:b/>
+                <w:bCs/>
+                <w:lang w:val="en-SE"/>
+              </w:rPr>
+            </w:pPr>
+          </w:p>
+        </w:tc>
+      </w:tr>
+      <w:tr>
+        <w:tc>
+          <w:tcPr>
+            <w:tcW w:w="3005" w:type="dxa"/>
+          </w:tcPr>
+          <w:p>
+            <w:pPr>
+              <w:jc w:val="center"/>
+              <w:rPr>
+                <w:b/>
+                <w:bCs/>
+                <w:lang w:val="en-SE"/>
+              </w:rPr>
+            </w:pPr>
+          </w:p>
+        </w:tc>
+        <w:tc>
+          <w:tcPr>
+            <w:tcW w:w="3005" w:type="dxa"/>
+          </w:tcPr>
+          <w:p>
+            <w:pPr>
+              <w:jc w:val="center"/>
+              <w:rPr>
+                <w:b/>
+                <w:bCs/>
+                <w:lang w:val="en-SE"/>
+              </w:rPr>
+            </w:pPr>
+          </w:p>
+        </w:tc>
+        <w:tc>
+          <w:tcPr>
+            <w:tcW w:w="3006" w:type="dxa"/>
+          </w:tcPr>
+          <w:p>
+            <w:pPr>
+              <w:jc w:val="center"/>
+              <w:rPr>
+                <w:b/>
+                <w:bCs/>
+                <w:lang w:val="en-SE"/>
+              </w:rPr>
+            </w:pPr>
+          </w:p>
+        </w:tc>
+      </w:tr>
+      <w:tr>
+        <w:tc>
+          <w:tcPr>
+            <w:tcW w:w="3005" w:type="dxa"/>
+          </w:tcPr>
+          <w:p>
+            <w:pPr>
+              <w:jc w:val="center"/>
+              <w:rPr>
+                <w:b/>
+                <w:bCs/>
+                <w:lang w:val="en-SE"/>
+              </w:rPr>
+            </w:pPr>
+          </w:p>
+        </w:tc>
+        <w:tc>
+          <w:tcPr>
+            <w:tcW w:w="3005" w:type="dxa"/>
+          </w:tcPr>
+          <w:p>
+            <w:pPr>
+              <w:jc w:val="center"/>
+              <w:rPr>
+                <w:b/>
+                <w:bCs/>
+                <w:lang w:val="en-SE"/>
+              </w:rPr>
+            </w:pPr>
+          </w:p>
+        </w:tc>
+        <w:tc>
+          <w:tcPr>
+            <w:tcW w:w="3006" w:type="dxa"/>
+          </w:tcPr>
+          <w:p>
+            <w:pPr>
+              <w:jc w:val="center"/>
+              <w:rPr>
+                <w:b/>
+                <w:bCs/>
+                <w:lang w:val="en-SE"/>
+              </w:rPr>
+            </w:pPr>
+          </w:p>
+        </w:tc>
+      </w:tr>
+      <w:tr>
+        <w:tc>
+          <w:tcPr>
+            <w:tcW w:w="3005" w:type="dxa"/>
+          </w:tcPr>
+          <w:p>
+            <w:pPr>
+              <w:jc w:val="center"/>
+              <w:rPr>
+                <w:b/>
+                <w:bCs/>
+                <w:lang w:val="en-SE"/>
+              </w:rPr>
+            </w:pPr>
+          </w:p>
+        </w:tc>
+        <w:tc>
+          <w:tcPr>
+            <w:tcW w:w="3005" w:type="dxa"/>
+          </w:tcPr>
+          <w:p>
+            <w:pPr>
+              <w:jc w:val="center"/>
+              <w:rPr>
+                <w:b/>
+                <w:bCs/>
+                <w:lang w:val="en-SE"/>
+              </w:rPr>
+            </w:pPr>
+          </w:p>
+        </w:tc>
+        <w:tc>
+          <w:tcPr>
+            <w:tcW w:w="3006" w:type="dxa"/>
+          </w:tcPr>
+          <w:p>
+            <w:pPr>
+              <w:jc w:val="center"/>
+              <w:rPr>
+                <w:b/>
+                <w:bCs/>
+                <w:lang w:val="en-SE"/>
+              </w:rPr>
+            </w:pPr>
+          </w:p>
+        </w:tc>
+      </w:tr>
+      <w:tr>
+        <w:tc>
+          <w:tcPr>
+            <w:tcW w:w="3005" w:type="dxa"/>
+          </w:tcPr>
+          <w:p>
+            <w:pPr>
+              <w:jc w:val="center"/>
+              <w:rPr>
+                <w:b/>
+                <w:bCs/>
+                <w:lang w:val="en-SE"/>
+              </w:rPr>
+            </w:pPr>
+          </w:p>
+        </w:tc>
+        <w:tc>
+          <w:tcPr>
+            <w:tcW w:w="3005" w:type="dxa"/>
+          </w:tcPr>
+          <w:p>
+            <w:pPr>
+              <w:jc w:val="center"/>
+              <w:rPr>
+                <w:b/>
+                <w:bCs/>
+                <w:lang w:val="en-SE"/>
+              </w:rPr>
+            </w:pPr>
+          </w:p>
+        </w:tc>
+        <w:tc>
+          <w:tcPr>
+            <w:tcW w:w="3006" w:type="dxa"/>
+          </w:tcPr>
+          <w:p>
+            <w:pPr>
+              <w:jc w:val="center"/>
+              <w:rPr>
+                <w:b/>
+                <w:bCs/>
+                <w:lang w:val="en-SE"/>
+              </w:rPr>
+            </w:pPr>
+          </w:p>
+        </w:tc>
+      </w:tr>
+    </w:tbl>
+    <w:p>
+      <w:pPr>
+        <w:jc w:val="center"/>
         <w:rPr>
           <w:b/>
           <w:bCs/>
           <w:lang w:val="en-SE"/>
         </w:rPr>
-        <w:t>SCD Strategy</w:t>
-      </w:r>
+      </w:pPr>
     </w:p>
     <w:sectPr>
       <w:pgSz w:w="11906" w:h="16838"/>
@@ -708,6 +1377,127 @@
     </w:sectPr>
   </w:body>
 </w:document>
+</file>
+
+<file path=word/numbering.xml><?xml version="1.0" encoding="utf-8"?>
+<w:numbering xmlns:wpc="http://schemas.microsoft.com/office/word/2010/wordprocessingCanvas" xmlns:cx="http://schemas.microsoft.com/office/drawing/2014/chartex" xmlns:cx1="http://schemas.microsoft.com/office/drawing/2015/9/8/chartex" xmlns:cx2="http://schemas.microsoft.com/office/drawing/2015/10/21/chartex" xmlns:cx3="http://schemas.microsoft.com/office/drawing/2016/5/9/chartex" xmlns:cx4="http://schemas.microsoft.com/office/drawing/2016/5/10/chartex" xmlns:cx5="http://schemas.microsoft.com/office/drawing/2016/5/11/chartex" xmlns:cx6="http://schemas.microsoft.com/office/drawing/2016/5/12/chartex" xmlns:cx7="http://schemas.microsoft.com/office/drawing/2016/5/13/chartex" xmlns:cx8="http://schemas.microsoft.com/office/drawing/2016/5/14/chartex" xmlns:mc="http://schemas.openxmlformats.org/markup-compatibility/2006" xmlns:aink="http://schemas.microsoft.com/office/drawing/2016/ink" xmlns:am3d="http://schemas.microsoft.com/office/drawing/2017/model3d" xmlns:o="urn:schemas-microsoft-com:office:office" xmlns:oel="http://schemas.microsoft.com/office/2019/extlst" xmlns:r="http://schemas.openxmlformats.org/officeDocument/2006/relationships" xmlns:m="http://schemas.openxmlformats.org/officeDocument/2006/math" xmlns:v="urn:schemas-microsoft-com:vml" xmlns:wp14="http://schemas.microsoft.com/office/word/2010/wordprocessingDrawing" xmlns:wp="http://schemas.openxmlformats.org/drawingml/2006/wordprocessingDrawing" xmlns:w10="urn:schemas-microsoft-com:office:word" xmlns:w="http://schemas.openxmlformats.org/wordprocessingml/2006/main" xmlns:w14="http://schemas.microsoft.com/office/word/2010/wordml" xmlns:w15="http://schemas.microsoft.com/office/word/2012/wordml" xmlns:w16cex="http://schemas.microsoft.com/office/word/2018/wordml/cex" xmlns:w16cid="http://schemas.microsoft.com/office/word/2016/wordml/cid" xmlns:w16="http://schemas.microsoft.com/office/word/2018/wordml" xmlns:w16du="http://schemas.microsoft.com/office/word/2023/wordml/word16du" xmlns:w16sdtdh="http://schemas.microsoft.com/office/word/2020/wordml/sdtdatahash" xmlns:w16sdtfl="http://schemas.microsoft.com/office/word/2024/wordml/sdtformatlock" xmlns:w16se="http://schemas.microsoft.com/office/word/2015/wordml/symex" xmlns:wpg="http://schemas.microsoft.com/office/word/2010/wordprocessingGroup" xmlns:wpi="http://schemas.microsoft.com/office/word/2010/wordprocessingInk" xmlns:wne="http://schemas.microsoft.com/office/word/2006/wordml" xmlns:wps="http://schemas.microsoft.com/office/word/2010/wordprocessingShape" mc:Ignorable="w14 w15 w16se w16cid w16 w16cex w16sdtdh w16sdtfl w16du wp14">
+  <w:abstractNum w:abstractNumId="0" w15:restartNumberingAfterBreak="0">
+    <w:nsid w:val="125B6BF9"/>
+    <w:multiLevelType w:val="hybridMultilevel"/>
+    <w:tmpl w:val="466AB6B4"/>
+    <w:lvl w:ilvl="0" w:tplc="4BDA78C2">
+      <w:start w:val="4"/>
+      <w:numFmt w:val="bullet"/>
+      <w:lvlText w:val="-"/>
+      <w:lvlJc w:val="left"/>
+      <w:pPr>
+        <w:ind w:left="720" w:hanging="360"/>
+      </w:pPr>
+      <w:rPr>
+        <w:rFonts w:ascii="Aptos" w:eastAsiaTheme="minorHAnsi" w:hAnsi="Aptos" w:cstheme="minorBidi" w:hint="default"/>
+      </w:rPr>
+    </w:lvl>
+    <w:lvl w:ilvl="1" w:tplc="20000003" w:tentative="1">
+      <w:start w:val="1"/>
+      <w:numFmt w:val="bullet"/>
+      <w:lvlText w:val="o"/>
+      <w:lvlJc w:val="left"/>
+      <w:pPr>
+        <w:ind w:left="1440" w:hanging="360"/>
+      </w:pPr>
+      <w:rPr>
+        <w:rFonts w:ascii="Courier New" w:hAnsi="Courier New" w:cs="Courier New" w:hint="default"/>
+      </w:rPr>
+    </w:lvl>
+    <w:lvl w:ilvl="2" w:tplc="20000005" w:tentative="1">
+      <w:start w:val="1"/>
+      <w:numFmt w:val="bullet"/>
+      <w:lvlText w:val=""/>
+      <w:lvlJc w:val="left"/>
+      <w:pPr>
+        <w:ind w:left="2160" w:hanging="360"/>
+      </w:pPr>
+      <w:rPr>
+        <w:rFonts w:ascii="Wingdings" w:hAnsi="Wingdings" w:hint="default"/>
+      </w:rPr>
+    </w:lvl>
+    <w:lvl w:ilvl="3" w:tplc="20000001" w:tentative="1">
+      <w:start w:val="1"/>
+      <w:numFmt w:val="bullet"/>
+      <w:lvlText w:val=""/>
+      <w:lvlJc w:val="left"/>
+      <w:pPr>
+        <w:ind w:left="2880" w:hanging="360"/>
+      </w:pPr>
+      <w:rPr>
+        <w:rFonts w:ascii="Symbol" w:hAnsi="Symbol" w:hint="default"/>
+      </w:rPr>
+    </w:lvl>
+    <w:lvl w:ilvl="4" w:tplc="20000003" w:tentative="1">
+      <w:start w:val="1"/>
+      <w:numFmt w:val="bullet"/>
+      <w:lvlText w:val="o"/>
+      <w:lvlJc w:val="left"/>
+      <w:pPr>
+        <w:ind w:left="3600" w:hanging="360"/>
+      </w:pPr>
+      <w:rPr>
+        <w:rFonts w:ascii="Courier New" w:hAnsi="Courier New" w:cs="Courier New" w:hint="default"/>
+      </w:rPr>
+    </w:lvl>
+    <w:lvl w:ilvl="5" w:tplc="20000005" w:tentative="1">
+      <w:start w:val="1"/>
+      <w:numFmt w:val="bullet"/>
+      <w:lvlText w:val=""/>
+      <w:lvlJc w:val="left"/>
+      <w:pPr>
+        <w:ind w:left="4320" w:hanging="360"/>
+      </w:pPr>
+      <w:rPr>
+        <w:rFonts w:ascii="Wingdings" w:hAnsi="Wingdings" w:hint="default"/>
+      </w:rPr>
+    </w:lvl>
+    <w:lvl w:ilvl="6" w:tplc="20000001" w:tentative="1">
+      <w:start w:val="1"/>
+      <w:numFmt w:val="bullet"/>
+      <w:lvlText w:val=""/>
+      <w:lvlJc w:val="left"/>
+      <w:pPr>
+        <w:ind w:left="5040" w:hanging="360"/>
+      </w:pPr>
+      <w:rPr>
+        <w:rFonts w:ascii="Symbol" w:hAnsi="Symbol" w:hint="default"/>
+      </w:rPr>
+    </w:lvl>
+    <w:lvl w:ilvl="7" w:tplc="20000003" w:tentative="1">
+      <w:start w:val="1"/>
+      <w:numFmt w:val="bullet"/>
+      <w:lvlText w:val="o"/>
+      <w:lvlJc w:val="left"/>
+      <w:pPr>
+        <w:ind w:left="5760" w:hanging="360"/>
+      </w:pPr>
+      <w:rPr>
+        <w:rFonts w:ascii="Courier New" w:hAnsi="Courier New" w:cs="Courier New" w:hint="default"/>
+      </w:rPr>
+    </w:lvl>
+    <w:lvl w:ilvl="8" w:tplc="20000005" w:tentative="1">
+      <w:start w:val="1"/>
+      <w:numFmt w:val="bullet"/>
+      <w:lvlText w:val=""/>
+      <w:lvlJc w:val="left"/>
+      <w:pPr>
+        <w:ind w:left="6480" w:hanging="360"/>
+      </w:pPr>
+      <w:rPr>
+        <w:rFonts w:ascii="Wingdings" w:hAnsi="Wingdings" w:hint="default"/>
+      </w:rPr>
+    </w:lvl>
+  </w:abstractNum>
+  <w:num w:numId="1" w16cid:durableId="536434437">
+    <w:abstractNumId w:val="0"/>
+  </w:num>
+</w:numbering>
 </file>
 
 <file path=word/styles.xml><?xml version="1.0" encoding="utf-8"?>
@@ -1110,6 +1900,7 @@
   <w:style w:type="paragraph" w:default="1" w:styleId="Normal">
     <w:name w:val="Normal"/>
     <w:qFormat/>
+    <w:rsid w:val="002710C3"/>
   </w:style>
   <w:style w:type="paragraph" w:styleId="Rubrik1">
     <w:name w:val="heading 1"/>

</xml_diff>